<commit_message>
Fix hardcoded user paths in backend services to use dynamic relative project root
</commit_message>
<xml_diff>
--- a/IQOQDQ/OQ_HMI/Machine type/VI 10/View_SettingsView_V0042_01_CartonErectionView_Tab_2.docx
+++ b/IQOQDQ/OQ_HMI/Machine type/VI 10/View_SettingsView_V0042_01_CartonErectionView_Tab_2.docx
@@ -5,122 +5,86 @@
     <w:tbl>
       <w:tblPr>
         <w:tblW w:w="9545" w:type="dxa"/>
-        <w:tblInd w:w="76" w:type="dxa"/>
-        <w:tblBorders>
-          <w:top w:val="single" w:sz="4" w:space="0" w:color="000000"/>
-          <w:left w:val="single" w:sz="4" w:space="0" w:color="000000"/>
-          <w:bottom w:val="single" w:sz="4" w:space="0" w:color="000000"/>
-          <w:right w:val="single" w:sz="4" w:space="0" w:color="000000"/>
-          <w:insideH w:val="single" w:sz="4" w:space="0" w:color="000000"/>
-          <w:insideV w:val="single" w:sz="4" w:space="0" w:color="000000"/>
-        </w:tblBorders>
+        <w:tblInd w:w="65" w:type="dxa"/>
         <w:tblLayout w:type="fixed"/>
         <w:tblCellMar>
-          <w:left w:w="0" w:type="dxa"/>
-          <w:right w:w="0" w:type="dxa"/>
+          <w:left w:w="70" w:type="dxa"/>
+          <w:right w:w="70" w:type="dxa"/>
         </w:tblCellMar>
-        <w:tblLook w:val="01E0" w:firstRow="1" w:lastRow="1" w:firstColumn="1" w:lastColumn="1" w:noHBand="0" w:noVBand="0"/>
+        <w:tblLook w:val="04A0" w:firstRow="1" w:lastRow="0" w:firstColumn="1" w:lastColumn="0" w:noHBand="0" w:noVBand="1"/>
       </w:tblPr>
       <w:tblGrid>
-        <w:gridCol w:w="2885"/>
-        <w:gridCol w:w="1800"/>
-        <w:gridCol w:w="1620"/>
-        <w:gridCol w:w="1618"/>
-        <w:gridCol w:w="1622"/>
+        <w:gridCol w:w="2886"/>
+        <w:gridCol w:w="1619"/>
+        <w:gridCol w:w="1619"/>
+        <w:gridCol w:w="1798"/>
+        <w:gridCol w:w="1623"/>
       </w:tblGrid>
       <w:tr>
         <w:trPr>
-          <w:trHeight w:val="426"/>
+          <w:cantSplit/>
+          <w:trHeight w:val="425"/>
         </w:trPr>
         <w:tc>
           <w:tcPr>
             <w:tcW w:w="9545" w:type="dxa"/>
             <w:gridSpan w:val="5"/>
-          </w:tcPr>
-          <w:p>
-            <w:pPr>
-              <w:pStyle w:val="TableParagraph"/>
-              <w:spacing w:before="98"/>
-              <w:rPr>
-                <w:b/>
-                <w:sz w:val="20"/>
-              </w:rPr>
+            <w:tcBorders>
+              <w:top w:val="single" w:sz="4" w:space="0" w:color="auto"/>
+              <w:left w:val="single" w:sz="4" w:space="0" w:color="auto"/>
+              <w:bottom w:val="single" w:sz="4" w:space="0" w:color="auto"/>
+              <w:right w:val="single" w:sz="4" w:space="0" w:color="000000"/>
+            </w:tcBorders>
+            <w:noWrap/>
+            <w:vAlign w:val="center"/>
+            <w:hideMark/>
+          </w:tcPr>
+          <w:p>
+            <w:pPr>
+              <w:pStyle w:val="Path"/>
             </w:pPr>
             <w:r>
-              <w:rPr>
-                <w:b/>
-                <w:sz w:val="20"/>
-              </w:rPr>
-              <w:t>51.</w:t>
-            </w:r>
-            <w:r>
-              <w:rPr>
-                <w:b/>
-                <w:spacing w:val="15"/>
-                <w:sz w:val="20"/>
-              </w:rPr>
-              <w:t xml:space="preserve"> </w:t>
-            </w:r>
-            <w:r>
-              <w:rPr>
-                <w:b/>
-                <w:sz w:val="20"/>
-              </w:rPr>
-              <w:t>\Operation\Carton</w:t>
-            </w:r>
-            <w:r>
-              <w:rPr>
-                <w:b/>
-                <w:sz w:val="20"/>
-              </w:rPr>
-              <w:t xml:space="preserve"> erection</w:t>
-            </w:r>
-            <w:r>
-              <w:rPr>
-                <w:b/>
-                <w:sz w:val="20"/>
-              </w:rPr>
               <w:t>\</w:t>
             </w:r>
             <w:r>
-              <w:rPr>
-                <w:b/>
-                <w:sz w:val="20"/>
-              </w:rPr>
-              <w:t>Carton</w:t>
+              <w:t>Operation</w:t>
             </w:r>
             <w:r>
-              <w:rPr>
-                <w:b/>
-                <w:spacing w:val="-9"/>
-                <w:sz w:val="20"/>
-              </w:rPr>
-              <w:t xml:space="preserve"> </w:t>
+              <w:t>\</w:t>
             </w:r>
             <w:r>
-              <w:rPr>
-                <w:b/>
-                <w:sz w:val="20"/>
-              </w:rPr>
-              <w:t>feeding</w:t>
+              <w:t>Carton erection\</w:t>
+            </w:r>
+            <w:r>
+              <w:t>Carton feeding</w:t>
             </w:r>
           </w:p>
         </w:tc>
       </w:tr>
       <w:tr>
         <w:trPr>
-          <w:trHeight w:val="5568"/>
+          <w:cantSplit/>
+          <w:trHeight w:val="425"/>
         </w:trPr>
         <w:tc>
           <w:tcPr>
             <w:tcW w:w="9545" w:type="dxa"/>
             <w:gridSpan w:val="5"/>
-          </w:tcPr>
-          <w:p>
-            <w:pPr>
-              <w:pStyle w:val="TableParagraph"/>
-              <w:rPr>
-                <w:sz w:val="20"/>
+            <w:tcBorders>
+              <w:top w:val="single" w:sz="4" w:space="0" w:color="auto"/>
+              <w:left w:val="single" w:sz="4" w:space="0" w:color="auto"/>
+              <w:bottom w:val="single" w:sz="4" w:space="0" w:color="auto"/>
+              <w:right w:val="single" w:sz="4" w:space="0" w:color="000000"/>
+            </w:tcBorders>
+            <w:noWrap/>
+            <w:vAlign w:val="center"/>
+            <w:hideMark/>
+          </w:tcPr>
+          <w:p>
+            <w:pPr>
+              <w:rPr>
+                <w:rFonts w:cs="Arial"/>
+                <w:szCs w:val="20"/>
               </w:rPr>
             </w:pPr>
             <w:r>
@@ -128,10 +92,10 @@
                 <w:noProof/>
               </w:rPr>
               <w:drawing>
-                <wp:inline distT="0" distB="0" distL="0" distR="0" wp14:anchorId="49CE075B" wp14:editId="7FFCF829">
-                  <wp:extent cx="6054725" cy="3403600"/>
-                  <wp:effectExtent l="0" t="0" r="3175" b="6350"/>
-                  <wp:docPr id="1856149973" name="Picture 28"/>
+                <wp:inline distT="0" distB="0" distL="0" distR="0" wp14:anchorId="186017C3" wp14:editId="1E171192">
+                  <wp:extent cx="5972175" cy="3358515"/>
+                  <wp:effectExtent l="0" t="0" r="9525" b="0"/>
+                  <wp:docPr id="398765024" name="Picture 1"/>
                   <wp:cNvGraphicFramePr>
                     <a:graphicFrameLocks xmlns:a="http://schemas.openxmlformats.org/drawingml/2006/main" noChangeAspect="1"/>
                   </wp:cNvGraphicFramePr>
@@ -139,7 +103,7 @@
                     <a:graphicData uri="http://schemas.openxmlformats.org/drawingml/2006/picture">
                       <pic:pic xmlns:pic="http://schemas.openxmlformats.org/drawingml/2006/picture">
                         <pic:nvPicPr>
-                          <pic:cNvPr id="0" name="Picture 8"/>
+                          <pic:cNvPr id="0" name="Picture 1"/>
                           <pic:cNvPicPr>
                             <a:picLocks noChangeAspect="1" noChangeArrowheads="1"/>
                           </pic:cNvPicPr>
@@ -160,7 +124,7 @@
                         <pic:spPr bwMode="auto">
                           <a:xfrm>
                             <a:off x="0" y="0"/>
-                            <a:ext cx="6054725" cy="3403600"/>
+                            <a:ext cx="5972175" cy="3358515"/>
                           </a:xfrm>
                           <a:prstGeom prst="rect">
                             <a:avLst/>
@@ -181,65 +145,69 @@
       </w:tr>
       <w:tr>
         <w:trPr>
-          <w:trHeight w:val="460"/>
+          <w:cantSplit/>
+          <w:trHeight w:val="425"/>
         </w:trPr>
         <w:tc>
           <w:tcPr>
-            <w:tcW w:w="2885" w:type="dxa"/>
-          </w:tcPr>
-          <w:p>
-            <w:pPr>
-              <w:pStyle w:val="TableParagraph"/>
-              <w:spacing w:before="114"/>
-              <w:rPr>
+            <w:tcW w:w="2886" w:type="dxa"/>
+            <w:tcBorders>
+              <w:top w:val="nil"/>
+              <w:left w:val="single" w:sz="4" w:space="0" w:color="auto"/>
+              <w:bottom w:val="single" w:sz="4" w:space="0" w:color="auto"/>
+              <w:right w:val="single" w:sz="4" w:space="0" w:color="auto"/>
+            </w:tcBorders>
+            <w:noWrap/>
+            <w:vAlign w:val="center"/>
+            <w:hideMark/>
+          </w:tcPr>
+          <w:p>
+            <w:pPr>
+              <w:rPr>
+                <w:rFonts w:cs="Arial"/>
                 <w:b/>
-                <w:sz w:val="20"/>
+                <w:bCs/>
+                <w:szCs w:val="20"/>
               </w:rPr>
             </w:pPr>
             <w:r>
               <w:rPr>
+                <w:rFonts w:cs="Arial"/>
                 <w:b/>
-                <w:spacing w:val="-2"/>
-                <w:sz w:val="20"/>
-              </w:rPr>
-              <w:t>Acceptance</w:t>
+                <w:bCs/>
+                <w:szCs w:val="20"/>
+              </w:rPr>
+              <w:t>Acceptance criterion</w:t>
             </w:r>
+          </w:p>
+        </w:tc>
+        <w:tc>
+          <w:tcPr>
+            <w:tcW w:w="1619" w:type="dxa"/>
+            <w:tcBorders>
+              <w:top w:val="nil"/>
+              <w:left w:val="nil"/>
+              <w:bottom w:val="single" w:sz="4" w:space="0" w:color="auto"/>
+              <w:right w:val="single" w:sz="4" w:space="0" w:color="auto"/>
+            </w:tcBorders>
+            <w:vAlign w:val="center"/>
+            <w:hideMark/>
+          </w:tcPr>
+          <w:p>
+            <w:pPr>
+              <w:rPr>
+                <w:rFonts w:cs="Arial"/>
+                <w:b/>
+                <w:bCs/>
+                <w:szCs w:val="20"/>
+              </w:rPr>
+            </w:pPr>
             <w:r>
               <w:rPr>
+                <w:rFonts w:cs="Arial"/>
                 <w:b/>
-                <w:spacing w:val="3"/>
-                <w:sz w:val="20"/>
-              </w:rPr>
-              <w:t xml:space="preserve"> </w:t>
-            </w:r>
-            <w:r>
-              <w:rPr>
-                <w:b/>
-                <w:spacing w:val="-2"/>
-                <w:sz w:val="20"/>
-              </w:rPr>
-              <w:t>criterion</w:t>
-            </w:r>
-          </w:p>
-        </w:tc>
-        <w:tc>
-          <w:tcPr>
-            <w:tcW w:w="1800" w:type="dxa"/>
-          </w:tcPr>
-          <w:p>
-            <w:pPr>
-              <w:pStyle w:val="TableParagraph"/>
-              <w:spacing w:before="114"/>
-              <w:rPr>
-                <w:b/>
-                <w:sz w:val="20"/>
-              </w:rPr>
-            </w:pPr>
-            <w:r>
-              <w:rPr>
-                <w:b/>
-                <w:spacing w:val="-2"/>
-                <w:sz w:val="20"/>
+                <w:bCs/>
+                <w:szCs w:val="20"/>
               </w:rPr>
               <w:t>Limits</w:t>
             </w:r>
@@ -247,84 +215,65 @@
         </w:tc>
         <w:tc>
           <w:tcPr>
-            <w:tcW w:w="1620" w:type="dxa"/>
-          </w:tcPr>
-          <w:p>
-            <w:pPr>
-              <w:pStyle w:val="TableParagraph"/>
-              <w:spacing w:line="230" w:lineRule="exact"/>
-              <w:ind w:right="495"/>
-              <w:rPr>
+            <w:tcW w:w="1619" w:type="dxa"/>
+            <w:tcBorders>
+              <w:top w:val="nil"/>
+              <w:left w:val="nil"/>
+              <w:bottom w:val="single" w:sz="4" w:space="0" w:color="auto"/>
+              <w:right w:val="single" w:sz="4" w:space="0" w:color="auto"/>
+            </w:tcBorders>
+            <w:noWrap/>
+            <w:vAlign w:val="center"/>
+            <w:hideMark/>
+          </w:tcPr>
+          <w:p>
+            <w:pPr>
+              <w:rPr>
+                <w:rFonts w:cs="Arial"/>
                 <w:b/>
-                <w:sz w:val="20"/>
+                <w:bCs/>
+                <w:szCs w:val="20"/>
               </w:rPr>
             </w:pPr>
             <w:r>
               <w:rPr>
+                <w:rFonts w:cs="Arial"/>
                 <w:b/>
-                <w:sz w:val="20"/>
-              </w:rPr>
-              <w:t>Pass</w:t>
+                <w:bCs/>
+                <w:szCs w:val="20"/>
+              </w:rPr>
+              <w:t>Pass / Fail: Dev-No.</w:t>
             </w:r>
+          </w:p>
+        </w:tc>
+        <w:tc>
+          <w:tcPr>
+            <w:tcW w:w="1798" w:type="dxa"/>
+            <w:tcBorders>
+              <w:top w:val="nil"/>
+              <w:left w:val="nil"/>
+              <w:bottom w:val="single" w:sz="4" w:space="0" w:color="auto"/>
+              <w:right w:val="single" w:sz="4" w:space="0" w:color="auto"/>
+            </w:tcBorders>
+            <w:noWrap/>
+            <w:vAlign w:val="center"/>
+            <w:hideMark/>
+          </w:tcPr>
+          <w:p>
+            <w:pPr>
+              <w:rPr>
+                <w:rFonts w:cs="Arial"/>
+                <w:b/>
+                <w:bCs/>
+                <w:szCs w:val="20"/>
+              </w:rPr>
+            </w:pPr>
             <w:r>
               <w:rPr>
+                <w:rFonts w:cs="Arial"/>
                 <w:b/>
-                <w:spacing w:val="-14"/>
-                <w:sz w:val="20"/>
-              </w:rPr>
-              <w:t xml:space="preserve"> </w:t>
-            </w:r>
-            <w:r>
-              <w:rPr>
-                <w:b/>
-                <w:sz w:val="20"/>
-              </w:rPr>
-              <w:t>/</w:t>
-            </w:r>
-            <w:r>
-              <w:rPr>
-                <w:b/>
-                <w:spacing w:val="-14"/>
-                <w:sz w:val="20"/>
-              </w:rPr>
-              <w:t xml:space="preserve"> </w:t>
-            </w:r>
-            <w:r>
-              <w:rPr>
-                <w:b/>
-                <w:sz w:val="20"/>
-              </w:rPr>
-              <w:t xml:space="preserve">Fail: </w:t>
-            </w:r>
-            <w:r>
-              <w:rPr>
-                <w:b/>
-                <w:spacing w:val="-2"/>
-                <w:sz w:val="20"/>
-              </w:rPr>
-              <w:t>Dev-No.</w:t>
-            </w:r>
-          </w:p>
-        </w:tc>
-        <w:tc>
-          <w:tcPr>
-            <w:tcW w:w="1618" w:type="dxa"/>
-          </w:tcPr>
-          <w:p>
-            <w:pPr>
-              <w:pStyle w:val="TableParagraph"/>
-              <w:spacing w:before="114"/>
-              <w:ind w:left="70"/>
-              <w:rPr>
-                <w:b/>
-                <w:sz w:val="20"/>
-              </w:rPr>
-            </w:pPr>
-            <w:r>
-              <w:rPr>
-                <w:b/>
-                <w:spacing w:val="-4"/>
-                <w:sz w:val="20"/>
+                <w:bCs/>
+                <w:szCs w:val="20"/>
               </w:rPr>
               <w:t>Date</w:t>
             </w:r>
@@ -332,23 +281,32 @@
         </w:tc>
         <w:tc>
           <w:tcPr>
-            <w:tcW w:w="1622" w:type="dxa"/>
-          </w:tcPr>
-          <w:p>
-            <w:pPr>
-              <w:pStyle w:val="TableParagraph"/>
-              <w:spacing w:before="114"/>
-              <w:ind w:left="70"/>
-              <w:rPr>
+            <w:tcW w:w="1623" w:type="dxa"/>
+            <w:tcBorders>
+              <w:top w:val="nil"/>
+              <w:left w:val="nil"/>
+              <w:bottom w:val="single" w:sz="4" w:space="0" w:color="auto"/>
+              <w:right w:val="single" w:sz="4" w:space="0" w:color="auto"/>
+            </w:tcBorders>
+            <w:noWrap/>
+            <w:vAlign w:val="center"/>
+            <w:hideMark/>
+          </w:tcPr>
+          <w:p>
+            <w:pPr>
+              <w:rPr>
+                <w:rFonts w:cs="Arial"/>
                 <w:b/>
-                <w:sz w:val="20"/>
+                <w:bCs/>
+                <w:szCs w:val="20"/>
               </w:rPr>
             </w:pPr>
             <w:r>
               <w:rPr>
+                <w:rFonts w:cs="Arial"/>
                 <w:b/>
-                <w:spacing w:val="-2"/>
-                <w:sz w:val="20"/>
+                <w:bCs/>
+                <w:szCs w:val="20"/>
               </w:rPr>
               <w:t>Initials</w:t>
             </w:r>
@@ -357,150 +315,127 @@
       </w:tr>
       <w:tr>
         <w:trPr>
-          <w:trHeight w:val="424"/>
+          <w:cantSplit/>
+          <w:trHeight w:val="426"/>
         </w:trPr>
         <w:tc>
           <w:tcPr>
-            <w:tcW w:w="2885" w:type="dxa"/>
-          </w:tcPr>
-          <w:p>
-            <w:pPr>
-              <w:pStyle w:val="TableParagraph"/>
-              <w:spacing w:before="98"/>
-              <w:rPr>
-                <w:b/>
-                <w:sz w:val="20"/>
+            <w:tcW w:w="2886" w:type="dxa"/>
+            <w:tcBorders>
+              <w:top w:val="nil"/>
+              <w:left w:val="single" w:sz="4" w:space="0" w:color="auto"/>
+              <w:bottom w:val="single" w:sz="4" w:space="0" w:color="auto"/>
+              <w:right w:val="single" w:sz="4" w:space="0" w:color="auto"/>
+            </w:tcBorders>
+            <w:noWrap/>
+            <w:vAlign w:val="center"/>
+            <w:hideMark/>
+          </w:tcPr>
+          <w:p>
+            <w:pPr>
+              <w:pStyle w:val="Testnummer"/>
+              <w:rPr>
+                <w:lang w:val="en-US"/>
               </w:rPr>
             </w:pPr>
             <w:r>
               <w:rPr>
-                <w:b/>
-                <w:sz w:val="20"/>
-              </w:rPr>
-              <w:t>Screen</w:t>
+                <w:lang w:val="en-US"/>
+              </w:rPr>
+              <w:t>Screen matches screenshot</w:t>
             </w:r>
+          </w:p>
+        </w:tc>
+        <w:tc>
+          <w:tcPr>
+            <w:tcW w:w="1619" w:type="dxa"/>
+            <w:tcBorders>
+              <w:top w:val="nil"/>
+              <w:left w:val="nil"/>
+              <w:bottom w:val="single" w:sz="4" w:space="0" w:color="auto"/>
+              <w:right w:val="single" w:sz="4" w:space="0" w:color="auto"/>
+            </w:tcBorders>
+            <w:vAlign w:val="center"/>
+            <w:hideMark/>
+          </w:tcPr>
+          <w:p>
+            <w:pPr>
+              <w:rPr>
+                <w:rFonts w:cs="Arial"/>
+                <w:szCs w:val="20"/>
+              </w:rPr>
+            </w:pPr>
             <w:r>
               <w:rPr>
-                <w:b/>
-                <w:spacing w:val="-9"/>
-                <w:sz w:val="20"/>
-              </w:rPr>
-              <w:t xml:space="preserve"> </w:t>
+                <w:rFonts w:cs="Arial"/>
+                <w:szCs w:val="20"/>
+              </w:rPr>
+              <w:t xml:space="preserve"> N / A </w:t>
             </w:r>
-            <w:r>
-              <w:rPr>
-                <w:b/>
-                <w:sz w:val="20"/>
-              </w:rPr>
-              <w:t>matches</w:t>
-            </w:r>
-            <w:r>
-              <w:rPr>
-                <w:b/>
-                <w:spacing w:val="-8"/>
-                <w:sz w:val="20"/>
-              </w:rPr>
-              <w:t xml:space="preserve"> </w:t>
-            </w:r>
-            <w:r>
-              <w:rPr>
-                <w:b/>
-                <w:spacing w:val="-2"/>
-                <w:sz w:val="20"/>
-              </w:rPr>
-              <w:t>screenshot</w:t>
-            </w:r>
-          </w:p>
-        </w:tc>
-        <w:tc>
-          <w:tcPr>
-            <w:tcW w:w="1800" w:type="dxa"/>
-          </w:tcPr>
-          <w:p>
-            <w:pPr>
-              <w:pStyle w:val="TableParagraph"/>
-              <w:spacing w:before="98"/>
-              <w:ind w:left="124"/>
-              <w:rPr>
-                <w:sz w:val="20"/>
-              </w:rPr>
-            </w:pPr>
-            <w:r>
-              <w:rPr>
-                <w:sz w:val="20"/>
-              </w:rPr>
-              <w:t>N</w:t>
-            </w:r>
-            <w:r>
-              <w:rPr>
-                <w:spacing w:val="-2"/>
-                <w:sz w:val="20"/>
-              </w:rPr>
-              <w:t xml:space="preserve"> </w:t>
-            </w:r>
-            <w:r>
-              <w:rPr>
-                <w:sz w:val="20"/>
-              </w:rPr>
-              <w:t>/</w:t>
-            </w:r>
-            <w:r>
-              <w:rPr>
-                <w:spacing w:val="-2"/>
-                <w:sz w:val="20"/>
-              </w:rPr>
-              <w:t xml:space="preserve"> </w:t>
-            </w:r>
-            <w:r>
-              <w:rPr>
-                <w:spacing w:val="-10"/>
-                <w:sz w:val="20"/>
-              </w:rPr>
-              <w:t>A</w:t>
-            </w:r>
-          </w:p>
-        </w:tc>
-        <w:tc>
-          <w:tcPr>
-            <w:tcW w:w="1620" w:type="dxa"/>
-          </w:tcPr>
-          <w:p>
-            <w:pPr>
-              <w:pStyle w:val="TableParagraph"/>
-              <w:ind w:left="0"/>
-              <w:rPr>
-                <w:rFonts w:ascii="Times New Roman"/>
-                <w:sz w:val="18"/>
-              </w:rPr>
-            </w:pPr>
-          </w:p>
-        </w:tc>
-        <w:tc>
-          <w:tcPr>
-            <w:tcW w:w="1618" w:type="dxa"/>
-          </w:tcPr>
-          <w:p>
-            <w:pPr>
-              <w:pStyle w:val="TableParagraph"/>
-              <w:ind w:left="0"/>
-              <w:rPr>
-                <w:rFonts w:ascii="Times New Roman"/>
-                <w:sz w:val="18"/>
-              </w:rPr>
-            </w:pPr>
-          </w:p>
-        </w:tc>
-        <w:tc>
-          <w:tcPr>
-            <w:tcW w:w="1622" w:type="dxa"/>
-          </w:tcPr>
-          <w:p>
-            <w:pPr>
-              <w:pStyle w:val="TableParagraph"/>
-              <w:ind w:left="0"/>
-              <w:rPr>
-                <w:rFonts w:ascii="Times New Roman"/>
-                <w:sz w:val="18"/>
+          </w:p>
+        </w:tc>
+        <w:tc>
+          <w:tcPr>
+            <w:tcW w:w="1619" w:type="dxa"/>
+            <w:tcBorders>
+              <w:top w:val="nil"/>
+              <w:left w:val="nil"/>
+              <w:bottom w:val="single" w:sz="4" w:space="0" w:color="auto"/>
+              <w:right w:val="single" w:sz="4" w:space="0" w:color="auto"/>
+            </w:tcBorders>
+            <w:noWrap/>
+            <w:vAlign w:val="center"/>
+            <w:hideMark/>
+          </w:tcPr>
+          <w:p>
+            <w:pPr>
+              <w:rPr>
+                <w:rFonts w:cs="Arial"/>
+                <w:szCs w:val="20"/>
+              </w:rPr>
+            </w:pPr>
+          </w:p>
+        </w:tc>
+        <w:tc>
+          <w:tcPr>
+            <w:tcW w:w="1798" w:type="dxa"/>
+            <w:tcBorders>
+              <w:top w:val="nil"/>
+              <w:left w:val="nil"/>
+              <w:bottom w:val="single" w:sz="4" w:space="0" w:color="auto"/>
+              <w:right w:val="single" w:sz="4" w:space="0" w:color="auto"/>
+            </w:tcBorders>
+            <w:noWrap/>
+            <w:vAlign w:val="center"/>
+            <w:hideMark/>
+          </w:tcPr>
+          <w:p>
+            <w:pPr>
+              <w:rPr>
+                <w:rFonts w:cs="Arial"/>
+                <w:szCs w:val="20"/>
+              </w:rPr>
+            </w:pPr>
+          </w:p>
+        </w:tc>
+        <w:tc>
+          <w:tcPr>
+            <w:tcW w:w="1623" w:type="dxa"/>
+            <w:tcBorders>
+              <w:top w:val="nil"/>
+              <w:left w:val="nil"/>
+              <w:bottom w:val="single" w:sz="4" w:space="0" w:color="auto"/>
+              <w:right w:val="single" w:sz="4" w:space="0" w:color="auto"/>
+            </w:tcBorders>
+            <w:noWrap/>
+            <w:vAlign w:val="center"/>
+            <w:hideMark/>
+          </w:tcPr>
+          <w:p>
+            <w:pPr>
+              <w:rPr>
+                <w:rFonts w:cs="Arial"/>
+                <w:szCs w:val="20"/>
               </w:rPr>
             </w:pPr>
           </w:p>
@@ -508,35 +443,53 @@
       </w:tr>
       <w:tr>
         <w:trPr>
-          <w:trHeight w:val="427"/>
+          <w:cantSplit/>
+          <w:trHeight w:val="426"/>
         </w:trPr>
         <w:tc>
           <w:tcPr>
-            <w:tcW w:w="2885" w:type="dxa"/>
-          </w:tcPr>
-          <w:p>
-            <w:pPr>
-              <w:pStyle w:val="TableParagraph"/>
-              <w:spacing w:before="98"/>
-              <w:rPr>
-                <w:sz w:val="20"/>
+            <w:tcW w:w="2886" w:type="dxa"/>
+            <w:tcBorders>
+              <w:top w:val="nil"/>
+              <w:left w:val="single" w:sz="4" w:space="0" w:color="auto"/>
+              <w:bottom w:val="single" w:sz="4" w:space="0" w:color="auto"/>
+              <w:right w:val="single" w:sz="4" w:space="0" w:color="auto"/>
+            </w:tcBorders>
+            <w:noWrap/>
+          </w:tcPr>
+          <w:p>
+            <w:pPr>
+              <w:pStyle w:val="Testnummer"/>
+              <w:rPr>
+                <w:b w:val="0"/>
+                <w:bCs/>
+                <w:lang w:val="en-US"/>
               </w:rPr>
             </w:pPr>
             <w:r>
+              <w:rPr>
+                <w:b w:val="0"/>
+                <w:bCs/>
+              </w:rPr>
               <w:t>Feed time</w:t>
             </w:r>
           </w:p>
         </w:tc>
         <w:tc>
           <w:tcPr>
-            <w:tcW w:w="1800" w:type="dxa"/>
-          </w:tcPr>
-          <w:p>
-            <w:pPr>
-              <w:pStyle w:val="TableParagraph"/>
-              <w:spacing w:before="98"/>
-              <w:rPr>
-                <w:sz w:val="20"/>
+            <w:tcW w:w="1619" w:type="dxa"/>
+            <w:tcBorders>
+              <w:top w:val="nil"/>
+              <w:left w:val="nil"/>
+              <w:bottom w:val="single" w:sz="4" w:space="0" w:color="auto"/>
+              <w:right w:val="single" w:sz="4" w:space="0" w:color="auto"/>
+            </w:tcBorders>
+          </w:tcPr>
+          <w:p>
+            <w:pPr>
+              <w:rPr>
+                <w:rFonts w:cs="Arial"/>
+                <w:szCs w:val="20"/>
               </w:rPr>
             </w:pPr>
             <w:r>
@@ -546,45 +499,63 @@
         </w:tc>
         <w:tc>
           <w:tcPr>
-            <w:tcW w:w="1620" w:type="dxa"/>
-          </w:tcPr>
-          <w:p>
-            <w:pPr>
-              <w:pStyle w:val="TableParagraph"/>
-              <w:ind w:left="0"/>
-              <w:rPr>
-                <w:rFonts w:ascii="Times New Roman"/>
-                <w:sz w:val="18"/>
-              </w:rPr>
-            </w:pPr>
-          </w:p>
-        </w:tc>
-        <w:tc>
-          <w:tcPr>
-            <w:tcW w:w="1618" w:type="dxa"/>
-          </w:tcPr>
-          <w:p>
-            <w:pPr>
-              <w:pStyle w:val="TableParagraph"/>
-              <w:ind w:left="0"/>
-              <w:rPr>
-                <w:rFonts w:ascii="Times New Roman"/>
-                <w:sz w:val="18"/>
-              </w:rPr>
-            </w:pPr>
-          </w:p>
-        </w:tc>
-        <w:tc>
-          <w:tcPr>
-            <w:tcW w:w="1622" w:type="dxa"/>
-          </w:tcPr>
-          <w:p>
-            <w:pPr>
-              <w:pStyle w:val="TableParagraph"/>
-              <w:ind w:left="0"/>
-              <w:rPr>
-                <w:rFonts w:ascii="Times New Roman"/>
-                <w:sz w:val="18"/>
+            <w:tcW w:w="1619" w:type="dxa"/>
+            <w:tcBorders>
+              <w:top w:val="nil"/>
+              <w:left w:val="nil"/>
+              <w:bottom w:val="single" w:sz="4" w:space="0" w:color="auto"/>
+              <w:right w:val="single" w:sz="4" w:space="0" w:color="auto"/>
+            </w:tcBorders>
+            <w:noWrap/>
+            <w:vAlign w:val="center"/>
+          </w:tcPr>
+          <w:p>
+            <w:pPr>
+              <w:rPr>
+                <w:rFonts w:cs="Arial"/>
+                <w:szCs w:val="20"/>
+              </w:rPr>
+            </w:pPr>
+          </w:p>
+        </w:tc>
+        <w:tc>
+          <w:tcPr>
+            <w:tcW w:w="1798" w:type="dxa"/>
+            <w:tcBorders>
+              <w:top w:val="nil"/>
+              <w:left w:val="nil"/>
+              <w:bottom w:val="single" w:sz="4" w:space="0" w:color="auto"/>
+              <w:right w:val="single" w:sz="4" w:space="0" w:color="auto"/>
+            </w:tcBorders>
+            <w:noWrap/>
+            <w:vAlign w:val="center"/>
+          </w:tcPr>
+          <w:p>
+            <w:pPr>
+              <w:rPr>
+                <w:rFonts w:cs="Arial"/>
+                <w:szCs w:val="20"/>
+              </w:rPr>
+            </w:pPr>
+          </w:p>
+        </w:tc>
+        <w:tc>
+          <w:tcPr>
+            <w:tcW w:w="1623" w:type="dxa"/>
+            <w:tcBorders>
+              <w:top w:val="nil"/>
+              <w:left w:val="nil"/>
+              <w:bottom w:val="single" w:sz="4" w:space="0" w:color="auto"/>
+              <w:right w:val="single" w:sz="4" w:space="0" w:color="auto"/>
+            </w:tcBorders>
+            <w:noWrap/>
+            <w:vAlign w:val="center"/>
+          </w:tcPr>
+          <w:p>
+            <w:pPr>
+              <w:rPr>
+                <w:rFonts w:cs="Arial"/>
+                <w:szCs w:val="20"/>
               </w:rPr>
             </w:pPr>
           </w:p>
@@ -592,35 +563,53 @@
       </w:tr>
       <w:tr>
         <w:trPr>
-          <w:trHeight w:val="424"/>
+          <w:cantSplit/>
+          <w:trHeight w:val="426"/>
         </w:trPr>
         <w:tc>
           <w:tcPr>
-            <w:tcW w:w="2885" w:type="dxa"/>
-          </w:tcPr>
-          <w:p>
-            <w:pPr>
-              <w:pStyle w:val="TableParagraph"/>
-              <w:spacing w:before="95"/>
-              <w:rPr>
-                <w:sz w:val="20"/>
+            <w:tcW w:w="2886" w:type="dxa"/>
+            <w:tcBorders>
+              <w:top w:val="nil"/>
+              <w:left w:val="single" w:sz="4" w:space="0" w:color="auto"/>
+              <w:bottom w:val="single" w:sz="4" w:space="0" w:color="auto"/>
+              <w:right w:val="single" w:sz="4" w:space="0" w:color="auto"/>
+            </w:tcBorders>
+            <w:noWrap/>
+          </w:tcPr>
+          <w:p>
+            <w:pPr>
+              <w:pStyle w:val="Testnummer"/>
+              <w:rPr>
+                <w:b w:val="0"/>
+                <w:bCs/>
+                <w:lang w:val="en-US"/>
               </w:rPr>
             </w:pPr>
             <w:r>
+              <w:rPr>
+                <w:b w:val="0"/>
+                <w:bCs/>
+              </w:rPr>
               <w:t>Break duration</w:t>
             </w:r>
           </w:p>
         </w:tc>
         <w:tc>
           <w:tcPr>
-            <w:tcW w:w="1800" w:type="dxa"/>
-          </w:tcPr>
-          <w:p>
-            <w:pPr>
-              <w:pStyle w:val="TableParagraph"/>
-              <w:spacing w:before="95"/>
-              <w:rPr>
-                <w:sz w:val="20"/>
+            <w:tcW w:w="1619" w:type="dxa"/>
+            <w:tcBorders>
+              <w:top w:val="nil"/>
+              <w:left w:val="nil"/>
+              <w:bottom w:val="single" w:sz="4" w:space="0" w:color="auto"/>
+              <w:right w:val="single" w:sz="4" w:space="0" w:color="auto"/>
+            </w:tcBorders>
+          </w:tcPr>
+          <w:p>
+            <w:pPr>
+              <w:rPr>
+                <w:rFonts w:cs="Arial"/>
+                <w:szCs w:val="20"/>
               </w:rPr>
             </w:pPr>
             <w:r>
@@ -630,45 +619,63 @@
         </w:tc>
         <w:tc>
           <w:tcPr>
-            <w:tcW w:w="1620" w:type="dxa"/>
-          </w:tcPr>
-          <w:p>
-            <w:pPr>
-              <w:pStyle w:val="TableParagraph"/>
-              <w:ind w:left="0"/>
-              <w:rPr>
-                <w:rFonts w:ascii="Times New Roman"/>
-                <w:sz w:val="18"/>
-              </w:rPr>
-            </w:pPr>
-          </w:p>
-        </w:tc>
-        <w:tc>
-          <w:tcPr>
-            <w:tcW w:w="1618" w:type="dxa"/>
-          </w:tcPr>
-          <w:p>
-            <w:pPr>
-              <w:pStyle w:val="TableParagraph"/>
-              <w:ind w:left="0"/>
-              <w:rPr>
-                <w:rFonts w:ascii="Times New Roman"/>
-                <w:sz w:val="18"/>
-              </w:rPr>
-            </w:pPr>
-          </w:p>
-        </w:tc>
-        <w:tc>
-          <w:tcPr>
-            <w:tcW w:w="1622" w:type="dxa"/>
-          </w:tcPr>
-          <w:p>
-            <w:pPr>
-              <w:pStyle w:val="TableParagraph"/>
-              <w:ind w:left="0"/>
-              <w:rPr>
-                <w:rFonts w:ascii="Times New Roman"/>
-                <w:sz w:val="18"/>
+            <w:tcW w:w="1619" w:type="dxa"/>
+            <w:tcBorders>
+              <w:top w:val="nil"/>
+              <w:left w:val="nil"/>
+              <w:bottom w:val="single" w:sz="4" w:space="0" w:color="auto"/>
+              <w:right w:val="single" w:sz="4" w:space="0" w:color="auto"/>
+            </w:tcBorders>
+            <w:noWrap/>
+            <w:vAlign w:val="center"/>
+          </w:tcPr>
+          <w:p>
+            <w:pPr>
+              <w:rPr>
+                <w:rFonts w:cs="Arial"/>
+                <w:szCs w:val="20"/>
+              </w:rPr>
+            </w:pPr>
+          </w:p>
+        </w:tc>
+        <w:tc>
+          <w:tcPr>
+            <w:tcW w:w="1798" w:type="dxa"/>
+            <w:tcBorders>
+              <w:top w:val="nil"/>
+              <w:left w:val="nil"/>
+              <w:bottom w:val="single" w:sz="4" w:space="0" w:color="auto"/>
+              <w:right w:val="single" w:sz="4" w:space="0" w:color="auto"/>
+            </w:tcBorders>
+            <w:noWrap/>
+            <w:vAlign w:val="center"/>
+          </w:tcPr>
+          <w:p>
+            <w:pPr>
+              <w:rPr>
+                <w:rFonts w:cs="Arial"/>
+                <w:szCs w:val="20"/>
+              </w:rPr>
+            </w:pPr>
+          </w:p>
+        </w:tc>
+        <w:tc>
+          <w:tcPr>
+            <w:tcW w:w="1623" w:type="dxa"/>
+            <w:tcBorders>
+              <w:top w:val="nil"/>
+              <w:left w:val="nil"/>
+              <w:bottom w:val="single" w:sz="4" w:space="0" w:color="auto"/>
+              <w:right w:val="single" w:sz="4" w:space="0" w:color="auto"/>
+            </w:tcBorders>
+            <w:noWrap/>
+            <w:vAlign w:val="center"/>
+          </w:tcPr>
+          <w:p>
+            <w:pPr>
+              <w:rPr>
+                <w:rFonts w:cs="Arial"/>
+                <w:szCs w:val="20"/>
               </w:rPr>
             </w:pPr>
           </w:p>
@@ -676,35 +683,53 @@
       </w:tr>
       <w:tr>
         <w:trPr>
-          <w:trHeight w:val="580"/>
+          <w:cantSplit/>
+          <w:trHeight w:val="426"/>
         </w:trPr>
         <w:tc>
           <w:tcPr>
-            <w:tcW w:w="2885" w:type="dxa"/>
-          </w:tcPr>
-          <w:p>
-            <w:pPr>
-              <w:pStyle w:val="TableParagraph"/>
-              <w:spacing w:before="59"/>
-              <w:rPr>
-                <w:sz w:val="20"/>
+            <w:tcW w:w="2886" w:type="dxa"/>
+            <w:tcBorders>
+              <w:top w:val="nil"/>
+              <w:left w:val="single" w:sz="4" w:space="0" w:color="auto"/>
+              <w:bottom w:val="single" w:sz="4" w:space="0" w:color="auto"/>
+              <w:right w:val="single" w:sz="4" w:space="0" w:color="auto"/>
+            </w:tcBorders>
+            <w:noWrap/>
+          </w:tcPr>
+          <w:p>
+            <w:pPr>
+              <w:pStyle w:val="Testnummer"/>
+              <w:rPr>
+                <w:b w:val="0"/>
+                <w:bCs/>
+                <w:lang w:val="en-US"/>
               </w:rPr>
             </w:pPr>
             <w:r>
+              <w:rPr>
+                <w:b w:val="0"/>
+                <w:bCs/>
+              </w:rPr>
               <w:t>Speed</w:t>
             </w:r>
           </w:p>
         </w:tc>
         <w:tc>
           <w:tcPr>
-            <w:tcW w:w="1800" w:type="dxa"/>
-          </w:tcPr>
-          <w:p>
-            <w:pPr>
-              <w:pStyle w:val="TableParagraph"/>
-              <w:spacing w:before="174"/>
-              <w:rPr>
-                <w:sz w:val="20"/>
+            <w:tcW w:w="1619" w:type="dxa"/>
+            <w:tcBorders>
+              <w:top w:val="nil"/>
+              <w:left w:val="nil"/>
+              <w:bottom w:val="single" w:sz="4" w:space="0" w:color="auto"/>
+              <w:right w:val="single" w:sz="4" w:space="0" w:color="auto"/>
+            </w:tcBorders>
+          </w:tcPr>
+          <w:p>
+            <w:pPr>
+              <w:rPr>
+                <w:rFonts w:cs="Arial"/>
+                <w:szCs w:val="20"/>
               </w:rPr>
             </w:pPr>
             <w:r>
@@ -714,45 +739,63 @@
         </w:tc>
         <w:tc>
           <w:tcPr>
-            <w:tcW w:w="1620" w:type="dxa"/>
-          </w:tcPr>
-          <w:p>
-            <w:pPr>
-              <w:pStyle w:val="TableParagraph"/>
-              <w:ind w:left="0"/>
-              <w:rPr>
-                <w:rFonts w:ascii="Times New Roman"/>
-                <w:sz w:val="18"/>
-              </w:rPr>
-            </w:pPr>
-          </w:p>
-        </w:tc>
-        <w:tc>
-          <w:tcPr>
-            <w:tcW w:w="1618" w:type="dxa"/>
-          </w:tcPr>
-          <w:p>
-            <w:pPr>
-              <w:pStyle w:val="TableParagraph"/>
-              <w:ind w:left="0"/>
-              <w:rPr>
-                <w:rFonts w:ascii="Times New Roman"/>
-                <w:sz w:val="18"/>
-              </w:rPr>
-            </w:pPr>
-          </w:p>
-        </w:tc>
-        <w:tc>
-          <w:tcPr>
-            <w:tcW w:w="1622" w:type="dxa"/>
-          </w:tcPr>
-          <w:p>
-            <w:pPr>
-              <w:pStyle w:val="TableParagraph"/>
-              <w:ind w:left="0"/>
-              <w:rPr>
-                <w:rFonts w:ascii="Times New Roman"/>
-                <w:sz w:val="18"/>
+            <w:tcW w:w="1619" w:type="dxa"/>
+            <w:tcBorders>
+              <w:top w:val="nil"/>
+              <w:left w:val="nil"/>
+              <w:bottom w:val="single" w:sz="4" w:space="0" w:color="auto"/>
+              <w:right w:val="single" w:sz="4" w:space="0" w:color="auto"/>
+            </w:tcBorders>
+            <w:noWrap/>
+            <w:vAlign w:val="center"/>
+          </w:tcPr>
+          <w:p>
+            <w:pPr>
+              <w:rPr>
+                <w:rFonts w:cs="Arial"/>
+                <w:szCs w:val="20"/>
+              </w:rPr>
+            </w:pPr>
+          </w:p>
+        </w:tc>
+        <w:tc>
+          <w:tcPr>
+            <w:tcW w:w="1798" w:type="dxa"/>
+            <w:tcBorders>
+              <w:top w:val="nil"/>
+              <w:left w:val="nil"/>
+              <w:bottom w:val="single" w:sz="4" w:space="0" w:color="auto"/>
+              <w:right w:val="single" w:sz="4" w:space="0" w:color="auto"/>
+            </w:tcBorders>
+            <w:noWrap/>
+            <w:vAlign w:val="center"/>
+          </w:tcPr>
+          <w:p>
+            <w:pPr>
+              <w:rPr>
+                <w:rFonts w:cs="Arial"/>
+                <w:szCs w:val="20"/>
+              </w:rPr>
+            </w:pPr>
+          </w:p>
+        </w:tc>
+        <w:tc>
+          <w:tcPr>
+            <w:tcW w:w="1623" w:type="dxa"/>
+            <w:tcBorders>
+              <w:top w:val="nil"/>
+              <w:left w:val="nil"/>
+              <w:bottom w:val="single" w:sz="4" w:space="0" w:color="auto"/>
+              <w:right w:val="single" w:sz="4" w:space="0" w:color="auto"/>
+            </w:tcBorders>
+            <w:noWrap/>
+            <w:vAlign w:val="center"/>
+          </w:tcPr>
+          <w:p>
+            <w:pPr>
+              <w:rPr>
+                <w:rFonts w:cs="Arial"/>
+                <w:szCs w:val="20"/>
               </w:rPr>
             </w:pPr>
           </w:p>
@@ -760,35 +803,53 @@
       </w:tr>
       <w:tr>
         <w:trPr>
-          <w:trHeight w:val="577"/>
+          <w:cantSplit/>
+          <w:trHeight w:val="426"/>
         </w:trPr>
         <w:tc>
           <w:tcPr>
-            <w:tcW w:w="2885" w:type="dxa"/>
-          </w:tcPr>
-          <w:p>
-            <w:pPr>
-              <w:pStyle w:val="TableParagraph"/>
-              <w:spacing w:before="59"/>
-              <w:rPr>
-                <w:sz w:val="20"/>
+            <w:tcW w:w="2886" w:type="dxa"/>
+            <w:tcBorders>
+              <w:top w:val="nil"/>
+              <w:left w:val="single" w:sz="4" w:space="0" w:color="auto"/>
+              <w:bottom w:val="single" w:sz="4" w:space="0" w:color="auto"/>
+              <w:right w:val="single" w:sz="4" w:space="0" w:color="auto"/>
+            </w:tcBorders>
+            <w:noWrap/>
+          </w:tcPr>
+          <w:p>
+            <w:pPr>
+              <w:pStyle w:val="Testnummer"/>
+              <w:rPr>
+                <w:b w:val="0"/>
+                <w:bCs/>
+                <w:lang w:val="en-US"/>
               </w:rPr>
             </w:pPr>
             <w:r>
+              <w:rPr>
+                <w:b w:val="0"/>
+                <w:bCs/>
+              </w:rPr>
               <w:t>Vibrator interval</w:t>
             </w:r>
           </w:p>
         </w:tc>
         <w:tc>
           <w:tcPr>
-            <w:tcW w:w="1800" w:type="dxa"/>
-          </w:tcPr>
-          <w:p>
-            <w:pPr>
-              <w:pStyle w:val="TableParagraph"/>
-              <w:spacing w:before="174"/>
-              <w:rPr>
-                <w:sz w:val="20"/>
+            <w:tcW w:w="1619" w:type="dxa"/>
+            <w:tcBorders>
+              <w:top w:val="nil"/>
+              <w:left w:val="nil"/>
+              <w:bottom w:val="single" w:sz="4" w:space="0" w:color="auto"/>
+              <w:right w:val="single" w:sz="4" w:space="0" w:color="auto"/>
+            </w:tcBorders>
+          </w:tcPr>
+          <w:p>
+            <w:pPr>
+              <w:rPr>
+                <w:rFonts w:cs="Arial"/>
+                <w:szCs w:val="20"/>
               </w:rPr>
             </w:pPr>
             <w:r>
@@ -798,45 +859,63 @@
         </w:tc>
         <w:tc>
           <w:tcPr>
-            <w:tcW w:w="1620" w:type="dxa"/>
-          </w:tcPr>
-          <w:p>
-            <w:pPr>
-              <w:pStyle w:val="TableParagraph"/>
-              <w:ind w:left="0"/>
-              <w:rPr>
-                <w:rFonts w:ascii="Times New Roman"/>
-                <w:sz w:val="18"/>
-              </w:rPr>
-            </w:pPr>
-          </w:p>
-        </w:tc>
-        <w:tc>
-          <w:tcPr>
-            <w:tcW w:w="1618" w:type="dxa"/>
-          </w:tcPr>
-          <w:p>
-            <w:pPr>
-              <w:pStyle w:val="TableParagraph"/>
-              <w:ind w:left="0"/>
-              <w:rPr>
-                <w:rFonts w:ascii="Times New Roman"/>
-                <w:sz w:val="18"/>
-              </w:rPr>
-            </w:pPr>
-          </w:p>
-        </w:tc>
-        <w:tc>
-          <w:tcPr>
-            <w:tcW w:w="1622" w:type="dxa"/>
-          </w:tcPr>
-          <w:p>
-            <w:pPr>
-              <w:pStyle w:val="TableParagraph"/>
-              <w:ind w:left="0"/>
-              <w:rPr>
-                <w:rFonts w:ascii="Times New Roman"/>
-                <w:sz w:val="18"/>
+            <w:tcW w:w="1619" w:type="dxa"/>
+            <w:tcBorders>
+              <w:top w:val="nil"/>
+              <w:left w:val="nil"/>
+              <w:bottom w:val="single" w:sz="4" w:space="0" w:color="auto"/>
+              <w:right w:val="single" w:sz="4" w:space="0" w:color="auto"/>
+            </w:tcBorders>
+            <w:noWrap/>
+            <w:vAlign w:val="center"/>
+          </w:tcPr>
+          <w:p>
+            <w:pPr>
+              <w:rPr>
+                <w:rFonts w:cs="Arial"/>
+                <w:szCs w:val="20"/>
+              </w:rPr>
+            </w:pPr>
+          </w:p>
+        </w:tc>
+        <w:tc>
+          <w:tcPr>
+            <w:tcW w:w="1798" w:type="dxa"/>
+            <w:tcBorders>
+              <w:top w:val="nil"/>
+              <w:left w:val="nil"/>
+              <w:bottom w:val="single" w:sz="4" w:space="0" w:color="auto"/>
+              <w:right w:val="single" w:sz="4" w:space="0" w:color="auto"/>
+            </w:tcBorders>
+            <w:noWrap/>
+            <w:vAlign w:val="center"/>
+          </w:tcPr>
+          <w:p>
+            <w:pPr>
+              <w:rPr>
+                <w:rFonts w:cs="Arial"/>
+                <w:szCs w:val="20"/>
+              </w:rPr>
+            </w:pPr>
+          </w:p>
+        </w:tc>
+        <w:tc>
+          <w:tcPr>
+            <w:tcW w:w="1623" w:type="dxa"/>
+            <w:tcBorders>
+              <w:top w:val="nil"/>
+              <w:left w:val="nil"/>
+              <w:bottom w:val="single" w:sz="4" w:space="0" w:color="auto"/>
+              <w:right w:val="single" w:sz="4" w:space="0" w:color="auto"/>
+            </w:tcBorders>
+            <w:noWrap/>
+            <w:vAlign w:val="center"/>
+          </w:tcPr>
+          <w:p>
+            <w:pPr>
+              <w:rPr>
+                <w:rFonts w:cs="Arial"/>
+                <w:szCs w:val="20"/>
               </w:rPr>
             </w:pPr>
           </w:p>
@@ -844,36 +923,53 @@
       </w:tr>
       <w:tr>
         <w:trPr>
-          <w:trHeight w:val="580"/>
+          <w:cantSplit/>
+          <w:trHeight w:val="426"/>
         </w:trPr>
         <w:tc>
           <w:tcPr>
-            <w:tcW w:w="2885" w:type="dxa"/>
-          </w:tcPr>
-          <w:p>
-            <w:pPr>
-              <w:pStyle w:val="TableParagraph"/>
-              <w:spacing w:before="59"/>
-              <w:ind w:right="362"/>
-              <w:rPr>
-                <w:sz w:val="20"/>
+            <w:tcW w:w="2886" w:type="dxa"/>
+            <w:tcBorders>
+              <w:top w:val="nil"/>
+              <w:left w:val="single" w:sz="4" w:space="0" w:color="auto"/>
+              <w:bottom w:val="single" w:sz="4" w:space="0" w:color="auto"/>
+              <w:right w:val="single" w:sz="4" w:space="0" w:color="auto"/>
+            </w:tcBorders>
+            <w:noWrap/>
+          </w:tcPr>
+          <w:p>
+            <w:pPr>
+              <w:pStyle w:val="Testnummer"/>
+              <w:rPr>
+                <w:b w:val="0"/>
+                <w:bCs/>
+                <w:lang w:val="en-US"/>
               </w:rPr>
             </w:pPr>
             <w:r>
+              <w:rPr>
+                <w:b w:val="0"/>
+                <w:bCs/>
+              </w:rPr>
               <w:t>Vibrator duration</w:t>
             </w:r>
           </w:p>
         </w:tc>
         <w:tc>
           <w:tcPr>
-            <w:tcW w:w="1800" w:type="dxa"/>
-          </w:tcPr>
-          <w:p>
-            <w:pPr>
-              <w:pStyle w:val="TableParagraph"/>
-              <w:spacing w:before="174"/>
-              <w:rPr>
-                <w:sz w:val="20"/>
+            <w:tcW w:w="1619" w:type="dxa"/>
+            <w:tcBorders>
+              <w:top w:val="nil"/>
+              <w:left w:val="nil"/>
+              <w:bottom w:val="single" w:sz="4" w:space="0" w:color="auto"/>
+              <w:right w:val="single" w:sz="4" w:space="0" w:color="auto"/>
+            </w:tcBorders>
+          </w:tcPr>
+          <w:p>
+            <w:pPr>
+              <w:rPr>
+                <w:rFonts w:cs="Arial"/>
+                <w:szCs w:val="20"/>
               </w:rPr>
             </w:pPr>
             <w:r>
@@ -883,95 +979,75 @@
         </w:tc>
         <w:tc>
           <w:tcPr>
-            <w:tcW w:w="1620" w:type="dxa"/>
-          </w:tcPr>
-          <w:p>
-            <w:pPr>
-              <w:pStyle w:val="TableParagraph"/>
-              <w:ind w:left="0"/>
-              <w:rPr>
-                <w:rFonts w:ascii="Times New Roman"/>
-                <w:sz w:val="18"/>
-              </w:rPr>
-            </w:pPr>
-          </w:p>
-        </w:tc>
-        <w:tc>
-          <w:tcPr>
-            <w:tcW w:w="1618" w:type="dxa"/>
-          </w:tcPr>
-          <w:p>
-            <w:pPr>
-              <w:pStyle w:val="TableParagraph"/>
-              <w:ind w:left="0"/>
-              <w:rPr>
-                <w:rFonts w:ascii="Times New Roman"/>
-                <w:sz w:val="18"/>
-              </w:rPr>
-            </w:pPr>
-          </w:p>
-        </w:tc>
-        <w:tc>
-          <w:tcPr>
-            <w:tcW w:w="1622" w:type="dxa"/>
-          </w:tcPr>
-          <w:p>
-            <w:pPr>
-              <w:pStyle w:val="TableParagraph"/>
-              <w:ind w:left="0"/>
-              <w:rPr>
-                <w:rFonts w:ascii="Times New Roman"/>
-                <w:sz w:val="18"/>
+            <w:tcW w:w="1619" w:type="dxa"/>
+            <w:tcBorders>
+              <w:top w:val="nil"/>
+              <w:left w:val="nil"/>
+              <w:bottom w:val="single" w:sz="4" w:space="0" w:color="auto"/>
+              <w:right w:val="single" w:sz="4" w:space="0" w:color="auto"/>
+            </w:tcBorders>
+            <w:noWrap/>
+            <w:vAlign w:val="center"/>
+          </w:tcPr>
+          <w:p>
+            <w:pPr>
+              <w:rPr>
+                <w:rFonts w:cs="Arial"/>
+                <w:szCs w:val="20"/>
+              </w:rPr>
+            </w:pPr>
+          </w:p>
+        </w:tc>
+        <w:tc>
+          <w:tcPr>
+            <w:tcW w:w="1798" w:type="dxa"/>
+            <w:tcBorders>
+              <w:top w:val="nil"/>
+              <w:left w:val="nil"/>
+              <w:bottom w:val="single" w:sz="4" w:space="0" w:color="auto"/>
+              <w:right w:val="single" w:sz="4" w:space="0" w:color="auto"/>
+            </w:tcBorders>
+            <w:noWrap/>
+            <w:vAlign w:val="center"/>
+          </w:tcPr>
+          <w:p>
+            <w:pPr>
+              <w:rPr>
+                <w:rFonts w:cs="Arial"/>
+                <w:szCs w:val="20"/>
+              </w:rPr>
+            </w:pPr>
+          </w:p>
+        </w:tc>
+        <w:tc>
+          <w:tcPr>
+            <w:tcW w:w="1623" w:type="dxa"/>
+            <w:tcBorders>
+              <w:top w:val="nil"/>
+              <w:left w:val="nil"/>
+              <w:bottom w:val="single" w:sz="4" w:space="0" w:color="auto"/>
+              <w:right w:val="single" w:sz="4" w:space="0" w:color="auto"/>
+            </w:tcBorders>
+            <w:noWrap/>
+            <w:vAlign w:val="center"/>
+          </w:tcPr>
+          <w:p>
+            <w:pPr>
+              <w:rPr>
+                <w:rFonts w:cs="Arial"/>
+                <w:szCs w:val="20"/>
               </w:rPr>
             </w:pPr>
           </w:p>
         </w:tc>
       </w:tr>
     </w:tbl>
-    <w:p>
-      <w:pPr>
-        <w:rPr>
-          <w:b/>
-        </w:rPr>
-      </w:pPr>
-    </w:p>
-    <w:p>
-      <w:pPr>
-        <w:rPr>
-          <w:b/>
-        </w:rPr>
-      </w:pPr>
-    </w:p>
-    <w:p>
-      <w:pPr>
-        <w:rPr>
-          <w:b/>
-        </w:rPr>
-      </w:pPr>
-    </w:p>
-    <w:p>
-      <w:pPr>
-        <w:rPr>
-          <w:b/>
-        </w:rPr>
-      </w:pPr>
-    </w:p>
-    <w:p>
-      <w:pPr>
-        <w:rPr>
-          <w:b/>
-        </w:rPr>
-      </w:pPr>
-    </w:p>
+    <w:p/>
     <w:p>
       <w:pPr>
         <w:spacing w:after="160" w:line="278" w:lineRule="auto"/>
-        <w:rPr>
-          <w:b/>
-        </w:rPr>
       </w:pPr>
     </w:p>
-    <w:p/>
     <w:sectPr>
       <w:pgSz w:w="12240" w:h="15840"/>
       <w:pgMar w:top="1440" w:right="1440" w:bottom="1440" w:left="1440" w:header="720" w:footer="720" w:gutter="0"/>
@@ -2068,25 +2144,6 @@
       <w:b/>
     </w:rPr>
   </w:style>
-  <w:style w:type="paragraph" w:customStyle="1" w:styleId="TableParagraph">
-    <w:name w:val="Table Paragraph"/>
-    <w:basedOn w:val="Normal"/>
-    <w:uiPriority w:val="1"/>
-    <w:qFormat/>
-    <w:rsid w:val="006D564C"/>
-    <w:pPr>
-      <w:widowControl w:val="0"/>
-      <w:autoSpaceDE w:val="0"/>
-      <w:autoSpaceDN w:val="0"/>
-      <w:ind w:left="69"/>
-    </w:pPr>
-    <w:rPr>
-      <w:rFonts w:eastAsia="Arial" w:cs="Arial"/>
-      <w:sz w:val="22"/>
-      <w:szCs w:val="22"/>
-      <w:lang w:eastAsia="en-US"/>
-    </w:rPr>
-  </w:style>
 </w:styles>
 </file>
 

</xml_diff>